<commit_message>
Update final combined report
</commit_message>
<xml_diff>
--- a/reports/ТРПП_итоговый_проект_все части.docx
+++ b/reports/ТРПП_итоговый_проект_все части.docx
@@ -561,21 +561,7 @@
                 <w:b/>
                 <w:sz w:val="28"/>
               </w:rPr>
-              <w:t>Выполнил</w:t>
-            </w:r>
-            <w:r>
-              <w:rPr>
-                <w:b/>
-                <w:sz w:val="28"/>
-              </w:rPr>
-              <w:t>и</w:t>
-            </w:r>
-            <w:r>
-              <w:rPr>
-                <w:b/>
-                <w:sz w:val="28"/>
-              </w:rPr>
-              <w:t>:</w:t>
+              <w:t>Выполнили:</w:t>
             </w:r>
           </w:p>
           <w:p>
@@ -593,21 +579,7 @@
                 <w:bCs/>
                 <w:sz w:val="28"/>
               </w:rPr>
-              <w:t>Студент</w:t>
-            </w:r>
-            <w:r>
-              <w:rPr>
-                <w:bCs/>
-                <w:sz w:val="28"/>
-              </w:rPr>
-              <w:t>ы</w:t>
-            </w:r>
-            <w:r>
-              <w:rPr>
-                <w:bCs/>
-                <w:sz w:val="28"/>
-              </w:rPr>
-              <w:t xml:space="preserve"> группы</w:t>
+              <w:t>Студенты группы</w:t>
             </w:r>
             <w:r>
               <w:rPr>
@@ -668,13 +640,7 @@
               <w:rPr>
                 <w:sz w:val="28"/>
               </w:rPr>
-              <w:t xml:space="preserve">, </w:t>
-            </w:r>
-            <w:r>
-              <w:rPr>
-                <w:sz w:val="28"/>
-              </w:rPr>
-              <w:t xml:space="preserve">Багирян Марьям </w:t>
+              <w:t xml:space="preserve">, Багирян Марьям </w:t>
             </w:r>
             <w:proofErr w:type="spellStart"/>
             <w:r>
@@ -2901,6 +2867,7 @@
               <w:rPr>
                 <w:lang w:eastAsia="ru-RU"/>
               </w:rPr>
+              <w:lastRenderedPageBreak/>
               <w:t>Учёт площадок</w:t>
             </w:r>
           </w:p>
@@ -3833,14 +3800,11 @@
         <w:pStyle w:val="afa"/>
       </w:pPr>
       <w:r>
-        <w:rPr>
-          <w:lang w:val="en-US"/>
-        </w:rPr>
         <w:drawing>
-          <wp:inline distT="0" distB="0" distL="0" distR="0" wp14:anchorId="09B38CF3" wp14:editId="48330F68">
-            <wp:extent cx="6120130" cy="3980180"/>
-            <wp:effectExtent l="0" t="0" r="0" b="0"/>
-            <wp:docPr id="1659461669" name="Рисунок 1" descr="Изображение выглядит как текст, снимок экрана, программное обеспечение&#10;&#10;Контент, сгенерированный ИИ, может содержать ошибки."/>
+          <wp:inline distT="0" distB="0" distL="0" distR="0" wp14:anchorId="7D5C4771" wp14:editId="64E3E86F">
+            <wp:extent cx="5940425" cy="3719195"/>
+            <wp:effectExtent l="0" t="0" r="3175" b="1905"/>
+            <wp:docPr id="1310187589" name="Рисунок 1"/>
             <wp:cNvGraphicFramePr>
               <a:graphicFrameLocks xmlns:a="http://schemas.openxmlformats.org/drawingml/2006/main" noChangeAspect="1"/>
             </wp:cNvGraphicFramePr>
@@ -3848,7 +3812,7 @@
               <a:graphicData uri="http://schemas.openxmlformats.org/drawingml/2006/picture">
                 <pic:pic xmlns:pic="http://schemas.openxmlformats.org/drawingml/2006/picture">
                   <pic:nvPicPr>
-                    <pic:cNvPr id="1659461669" name="Рисунок 1" descr="Изображение выглядит как текст, снимок экрана, программное обеспечение&#10;&#10;Контент, сгенерированный ИИ, может содержать ошибки."/>
+                    <pic:cNvPr id="1310187589" name=""/>
                     <pic:cNvPicPr/>
                   </pic:nvPicPr>
                   <pic:blipFill>
@@ -3860,7 +3824,7 @@
                   <pic:spPr>
                     <a:xfrm>
                       <a:off x="0" y="0"/>
-                      <a:ext cx="6120130" cy="3980180"/>
+                      <a:ext cx="5940425" cy="3719195"/>
                     </a:xfrm>
                     <a:prstGeom prst="rect">
                       <a:avLst/>
@@ -3878,10 +3842,7 @@
         <w:pStyle w:val="af6"/>
       </w:pPr>
       <w:r>
-        <w:t xml:space="preserve">Рисунок </w:t>
-      </w:r>
-      <w:r>
-        <w:t xml:space="preserve">2 - </w:t>
+        <w:t xml:space="preserve">Рисунок 2 - </w:t>
       </w:r>
       <w:r>
         <w:t>Содержимое файла README.md</w:t>
@@ -3936,19 +3897,19 @@
       </w:r>
       <w:proofErr w:type="spellEnd"/>
       <w:r>
-        <w:t xml:space="preserve">, поэтому классический </w:t>
+        <w:t xml:space="preserve">, поэтому классический сборщик в виде </w:t>
+      </w:r>
+      <w:proofErr w:type="spellStart"/>
+      <w:r>
+        <w:t>Gradle</w:t>
+      </w:r>
+      <w:proofErr w:type="spellEnd"/>
+      <w:r>
+        <w:t xml:space="preserve"> к нему неприменим. Однако мы формально выполнили </w:t>
       </w:r>
       <w:r>
         <w:lastRenderedPageBreak/>
-        <w:t xml:space="preserve">сборщик в виде </w:t>
-      </w:r>
-      <w:proofErr w:type="spellStart"/>
-      <w:r>
-        <w:t>Gradle</w:t>
-      </w:r>
-      <w:proofErr w:type="spellEnd"/>
-      <w:r>
-        <w:t xml:space="preserve"> к нему неприменим. Однако мы формально выполнили требование для Python-проектов: в корне репозитория созданы файлы requirements.txt и setup.py.</w:t>
+        <w:t>требование для Python-проектов: в корне репозитория созданы файлы requirements.txt и setup.py.</w:t>
       </w:r>
     </w:p>
     <w:p>
@@ -4100,37 +4061,37 @@
         <w:pStyle w:val="a3"/>
       </w:pPr>
       <w:r>
+        <w:t xml:space="preserve">Управление зависимостями: образ postgres:16 описан как зависимость проекта. Он загружается автоматически — аналогично подтягиванию зависимостей через </w:t>
+      </w:r>
+      <w:proofErr w:type="spellStart"/>
+      <w:r>
+        <w:t>Maven</w:t>
+      </w:r>
+      <w:proofErr w:type="spellEnd"/>
+      <w:r>
+        <w:t xml:space="preserve"> или </w:t>
+      </w:r>
+      <w:proofErr w:type="spellStart"/>
+      <w:r>
+        <w:t>pip</w:t>
+      </w:r>
+      <w:proofErr w:type="spellEnd"/>
+      <w:r>
+        <w:t>.</w:t>
+      </w:r>
+    </w:p>
+    <w:p>
+      <w:pPr>
+        <w:pStyle w:val="a3"/>
+        <w:rPr>
+          <w:lang w:eastAsia="ru-RU"/>
+        </w:rPr>
+      </w:pPr>
+      <w:r>
+        <w:rPr>
+          <w:lang w:eastAsia="ru-RU"/>
+        </w:rPr>
         <w:lastRenderedPageBreak/>
-        <w:t xml:space="preserve">Управление зависимостями: образ postgres:16 описан как зависимость проекта. Он загружается автоматически — аналогично подтягиванию зависимостей через </w:t>
-      </w:r>
-      <w:proofErr w:type="spellStart"/>
-      <w:r>
-        <w:t>Maven</w:t>
-      </w:r>
-      <w:proofErr w:type="spellEnd"/>
-      <w:r>
-        <w:t xml:space="preserve"> или </w:t>
-      </w:r>
-      <w:proofErr w:type="spellStart"/>
-      <w:r>
-        <w:t>pip</w:t>
-      </w:r>
-      <w:proofErr w:type="spellEnd"/>
-      <w:r>
-        <w:t>.</w:t>
-      </w:r>
-    </w:p>
-    <w:p>
-      <w:pPr>
-        <w:pStyle w:val="a3"/>
-        <w:rPr>
-          <w:lang w:eastAsia="ru-RU"/>
-        </w:rPr>
-      </w:pPr>
-      <w:r>
-        <w:rPr>
-          <w:lang w:eastAsia="ru-RU"/>
-        </w:rPr>
         <w:t xml:space="preserve">Автоматическая «сборка»: благодаря директиве </w:t>
       </w:r>
       <w:proofErr w:type="spellStart"/>
@@ -4349,7 +4310,6 @@
       <w:bookmarkStart w:id="19" w:name="_Toc229867092"/>
       <w:bookmarkStart w:id="20" w:name="_Toc229870145"/>
       <w:r>
-        <w:lastRenderedPageBreak/>
         <w:t>Продолжение разработки и комментирование кода</w:t>
       </w:r>
       <w:bookmarkEnd w:id="19"/>
@@ -4368,7 +4328,11 @@
       </w:r>
       <w:proofErr w:type="spellEnd"/>
       <w:r>
-        <w:t xml:space="preserve"> осмысленными коммитами. Структура коммитов позволяет отследить эволюцию проекта от первой таблицы до финальных запросов. Каждый участник вносит изменения в соответствии со своей зоной ответственности.</w:t>
+        <w:t xml:space="preserve"> осмысленными коммитами. Структура коммитов позволяет отследить </w:t>
+      </w:r>
+      <w:r>
+        <w:lastRenderedPageBreak/>
+        <w:t>эволюцию проекта от первой таблицы до финальных запросов. Каждый участник вносит изменения в соответствии со своей зоной ответственности.</w:t>
       </w:r>
     </w:p>
     <w:p>
@@ -4605,35 +4569,35 @@
       </w:r>
       <w:proofErr w:type="spellStart"/>
       <w:r>
+        <w:t>Docstrings</w:t>
+      </w:r>
+      <w:proofErr w:type="spellEnd"/>
+      <w:r>
+        <w:t xml:space="preserve">, </w:t>
+      </w:r>
+      <w:proofErr w:type="spellStart"/>
+      <w:r>
+        <w:t>sphinx.ext.napoleon</w:t>
+      </w:r>
+      <w:proofErr w:type="spellEnd"/>
+      <w:r>
+        <w:t xml:space="preserve"> для поддержки Google-стиля), языка (русский) и темы оформления (</w:t>
+      </w:r>
+      <w:proofErr w:type="spellStart"/>
+      <w:r>
+        <w:t>alabaster</w:t>
+      </w:r>
+      <w:proofErr w:type="spellEnd"/>
+      <w:r>
+        <w:t>).</w:t>
+      </w:r>
+    </w:p>
+    <w:p>
+      <w:pPr>
+        <w:pStyle w:val="afa"/>
+      </w:pPr>
+      <w:r>
         <w:lastRenderedPageBreak/>
-        <w:t>Docstrings</w:t>
-      </w:r>
-      <w:proofErr w:type="spellEnd"/>
-      <w:r>
-        <w:t xml:space="preserve">, </w:t>
-      </w:r>
-      <w:proofErr w:type="spellStart"/>
-      <w:r>
-        <w:t>sphinx.ext.napoleon</w:t>
-      </w:r>
-      <w:proofErr w:type="spellEnd"/>
-      <w:r>
-        <w:t xml:space="preserve"> для поддержки Google-стиля), языка (русский) и темы оформления (</w:t>
-      </w:r>
-      <w:proofErr w:type="spellStart"/>
-      <w:r>
-        <w:t>alabaster</w:t>
-      </w:r>
-      <w:proofErr w:type="spellEnd"/>
-      <w:r>
-        <w:t>).</w:t>
-      </w:r>
-    </w:p>
-    <w:p>
-      <w:pPr>
-        <w:pStyle w:val="afa"/>
-      </w:pPr>
-      <w:r>
         <w:drawing>
           <wp:inline distT="0" distB="0" distL="0" distR="0" wp14:anchorId="4FE9A34F" wp14:editId="512AF82C">
             <wp:extent cx="6120130" cy="3980180"/>
@@ -4972,13 +4936,7 @@
         <w:pStyle w:val="af6"/>
       </w:pPr>
       <w:r>
-        <w:t xml:space="preserve">Рисунок </w:t>
-      </w:r>
-      <w:r>
-        <w:t>6</w:t>
-      </w:r>
-      <w:r>
-        <w:t xml:space="preserve"> - </w:t>
+        <w:t xml:space="preserve">Рисунок 6 - </w:t>
       </w:r>
       <w:proofErr w:type="spellStart"/>
       <w:r>
@@ -6777,7 +6735,6 @@
     <w:uiPriority w:val="1"/>
     <w:semiHidden/>
     <w:unhideWhenUsed/>
-    <w:rsid w:val="00886157"/>
   </w:style>
   <w:style w:type="table" w:default="1" w:styleId="a6">
     <w:name w:val="Normal Table"/>
@@ -6799,7 +6756,6 @@
     <w:uiPriority w:val="99"/>
     <w:semiHidden/>
     <w:unhideWhenUsed/>
-    <w:rsid w:val="00886157"/>
   </w:style>
   <w:style w:type="character" w:customStyle="1" w:styleId="11">
     <w:name w:val="Заголовок 1 Знак"/>

</xml_diff>